<commit_message>
Add Bug Report Week 2 - QA findings
</commit_message>
<xml_diff>
--- a/Bug_Report_Week2_1.docx
+++ b/Bug_Report_Week2_1.docx
@@ -502,16 +502,6 @@
       <w:pPr>
         <w:spacing w:before="60" w:after="60"/>
       </w:pPr>
-      <w:r>
-        <w:rPr>
-          <w:rFonts w:ascii="Arial" w:eastAsia="Arial" w:hAnsi="Arial" w:cs="Arial"/>
-          <w:i/>
-          <w:iCs/>
-          <w:sz w:val="22"/>
-          <w:szCs w:val="22"/>
-        </w:rPr>
-        <w:t>Please notify QA once these are fixed so re-testing can be performed.</w:t>
-      </w:r>
     </w:p>
     <w:sectPr>
       <w:pgSz w:w="12240" w:h="15840"/>

</xml_diff>

<commit_message>
Update Bug Report - Add Bugs 3 and 4
</commit_message>
<xml_diff>
--- a/Bug_Report_Week2_1.docx
+++ b/Bug_Report_Week2_1.docx
@@ -87,38 +87,18 @@
           <w:sz w:val="26"/>
           <w:szCs w:val="26"/>
         </w:rPr>
-        <w:t>Bug 1</w:t>
-      </w:r>
+        <w:t>Bug 1: Wrong Simulation Status Endpoint</w:t>
+      </w:r>
+    </w:p>
+    <w:p>
+      <w:pPr>
+        <w:spacing w:before="60" w:after="60"/>
+      </w:pPr>
       <w:r>
         <w:rPr>
           <w:rFonts w:ascii="Arial" w:eastAsia="Arial" w:hAnsi="Arial" w:cs="Arial"/>
           <w:b/>
           <w:bCs/>
-          <w:sz w:val="26"/>
-          <w:szCs w:val="26"/>
-        </w:rPr>
-        <w:t>:</w:t>
-      </w:r>
-      <w:r>
-        <w:rPr>
-          <w:rFonts w:ascii="Arial" w:eastAsia="Arial" w:hAnsi="Arial" w:cs="Arial"/>
-          <w:b/>
-          <w:bCs/>
-          <w:sz w:val="26"/>
-          <w:szCs w:val="26"/>
-        </w:rPr>
-        <w:t xml:space="preserve"> Wrong Simulation Status Endpoint</w:t>
-      </w:r>
-    </w:p>
-    <w:p>
-      <w:pPr>
-        <w:spacing w:before="60" w:after="60"/>
-      </w:pPr>
-      <w:r>
-        <w:rPr>
-          <w:rFonts w:ascii="Arial" w:eastAsia="Arial" w:hAnsi="Arial" w:cs="Arial"/>
-          <w:b/>
-          <w:bCs/>
           <w:sz w:val="22"/>
           <w:szCs w:val="22"/>
         </w:rPr>
@@ -135,71 +115,25 @@
           <w:sz w:val="22"/>
           <w:szCs w:val="22"/>
         </w:rPr>
-        <w:t xml:space="preserve">Location: </w:t>
-      </w:r>
-      <w:proofErr w:type="spellStart"/>
-      <w:proofErr w:type="gramStart"/>
-      <w:r>
-        <w:rPr>
-          <w:rFonts w:ascii="Arial" w:eastAsia="Arial" w:hAnsi="Arial" w:cs="Arial"/>
-          <w:sz w:val="22"/>
-          <w:szCs w:val="22"/>
-        </w:rPr>
-        <w:t>inputThread</w:t>
-      </w:r>
-      <w:proofErr w:type="spellEnd"/>
-      <w:r>
-        <w:rPr>
-          <w:rFonts w:ascii="Arial" w:eastAsia="Arial" w:hAnsi="Arial" w:cs="Arial"/>
-          <w:sz w:val="22"/>
-          <w:szCs w:val="22"/>
-        </w:rPr>
-        <w:t>(</w:t>
-      </w:r>
-      <w:proofErr w:type="gramEnd"/>
-      <w:r>
-        <w:rPr>
-          <w:rFonts w:ascii="Arial" w:eastAsia="Arial" w:hAnsi="Arial" w:cs="Arial"/>
-          <w:sz w:val="22"/>
-          <w:szCs w:val="22"/>
-        </w:rPr>
-        <w:t>) function</w:t>
-      </w:r>
-    </w:p>
-    <w:p>
-      <w:pPr>
-        <w:spacing w:before="60" w:after="60"/>
-      </w:pPr>
-    </w:p>
-    <w:p>
-      <w:pPr>
-        <w:spacing w:before="60" w:after="60"/>
-      </w:pPr>
-      <w:r>
-        <w:rPr>
-          <w:rFonts w:ascii="Arial" w:eastAsia="Arial" w:hAnsi="Arial" w:cs="Arial"/>
-          <w:sz w:val="22"/>
-          <w:szCs w:val="22"/>
-        </w:rPr>
-        <w:t xml:space="preserve">The </w:t>
-      </w:r>
-      <w:proofErr w:type="spellStart"/>
-      <w:r>
-        <w:rPr>
-          <w:rFonts w:ascii="Arial" w:eastAsia="Arial" w:hAnsi="Arial" w:cs="Arial"/>
-          <w:sz w:val="22"/>
-          <w:szCs w:val="22"/>
-        </w:rPr>
-        <w:t>inputThread</w:t>
-      </w:r>
-      <w:proofErr w:type="spellEnd"/>
-      <w:r>
-        <w:rPr>
-          <w:rFonts w:ascii="Arial" w:eastAsia="Arial" w:hAnsi="Arial" w:cs="Arial"/>
-          <w:sz w:val="22"/>
-          <w:szCs w:val="22"/>
-        </w:rPr>
-        <w:t xml:space="preserve"> is calling GET /Simulation/status to check if the simulation is complete. The correct endpoint per the API spec is GET /Simulation/check. Because of this the simulation completion is never properly detected and the program may not exit cleanly.</w:t>
+        <w:t>Location: inputThread() function</w:t>
+      </w:r>
+    </w:p>
+    <w:p>
+      <w:pPr>
+        <w:spacing w:before="60" w:after="60"/>
+      </w:pPr>
+    </w:p>
+    <w:p>
+      <w:pPr>
+        <w:spacing w:before="60" w:after="60"/>
+      </w:pPr>
+      <w:r>
+        <w:rPr>
+          <w:rFonts w:ascii="Arial" w:eastAsia="Arial" w:hAnsi="Arial" w:cs="Arial"/>
+          <w:sz w:val="22"/>
+          <w:szCs w:val="22"/>
+        </w:rPr>
+        <w:t>The inputThread is calling GET /Simulation/status to check if the simulation is complete. The correct endpoint per the API spec is GET /Simulation/check. Because of this the simulation completion is never properly detected and the program may not exit cleanly.</w:t>
       </w:r>
     </w:p>
     <w:p>
@@ -235,25 +169,7 @@
           <w:sz w:val="22"/>
           <w:szCs w:val="22"/>
         </w:rPr>
-        <w:t xml:space="preserve">Change /Simulation/status to /Simulation/check in the </w:t>
-      </w:r>
-      <w:proofErr w:type="spellStart"/>
-      <w:r>
-        <w:rPr>
-          <w:rFonts w:ascii="Arial" w:eastAsia="Arial" w:hAnsi="Arial" w:cs="Arial"/>
-          <w:sz w:val="22"/>
-          <w:szCs w:val="22"/>
-        </w:rPr>
-        <w:t>inputThread</w:t>
-      </w:r>
-      <w:proofErr w:type="spellEnd"/>
-      <w:r>
-        <w:rPr>
-          <w:rFonts w:ascii="Arial" w:eastAsia="Arial" w:hAnsi="Arial" w:cs="Arial"/>
-          <w:sz w:val="22"/>
-          <w:szCs w:val="22"/>
-        </w:rPr>
-        <w:t xml:space="preserve"> function</w:t>
+        <w:t>Change /Simulation/status to /Simulation/check in the inputThread function</w:t>
       </w:r>
     </w:p>
     <w:p>
@@ -274,38 +190,18 @@
           <w:sz w:val="26"/>
           <w:szCs w:val="26"/>
         </w:rPr>
-        <w:t>Bug 2</w:t>
-      </w:r>
+        <w:t>Bug 2: No Journey Completion Tracking</w:t>
+      </w:r>
+    </w:p>
+    <w:p>
+      <w:pPr>
+        <w:spacing w:before="60" w:after="60"/>
+      </w:pPr>
       <w:r>
         <w:rPr>
           <w:rFonts w:ascii="Arial" w:eastAsia="Arial" w:hAnsi="Arial" w:cs="Arial"/>
           <w:b/>
           <w:bCs/>
-          <w:sz w:val="26"/>
-          <w:szCs w:val="26"/>
-        </w:rPr>
-        <w:t>:</w:t>
-      </w:r>
-      <w:r>
-        <w:rPr>
-          <w:rFonts w:ascii="Arial" w:eastAsia="Arial" w:hAnsi="Arial" w:cs="Arial"/>
-          <w:b/>
-          <w:bCs/>
-          <w:sz w:val="26"/>
-          <w:szCs w:val="26"/>
-        </w:rPr>
-        <w:t xml:space="preserve"> No Journey Completion Tracking</w:t>
-      </w:r>
-    </w:p>
-    <w:p>
-      <w:pPr>
-        <w:spacing w:before="60" w:after="60"/>
-      </w:pPr>
-      <w:r>
-        <w:rPr>
-          <w:rFonts w:ascii="Arial" w:eastAsia="Arial" w:hAnsi="Arial" w:cs="Arial"/>
-          <w:b/>
-          <w:bCs/>
           <w:sz w:val="22"/>
           <w:szCs w:val="22"/>
         </w:rPr>
@@ -322,89 +218,25 @@
           <w:sz w:val="22"/>
           <w:szCs w:val="22"/>
         </w:rPr>
-        <w:t xml:space="preserve">Location: </w:t>
-      </w:r>
-      <w:proofErr w:type="spellStart"/>
-      <w:proofErr w:type="gramStart"/>
-      <w:r>
-        <w:rPr>
-          <w:rFonts w:ascii="Arial" w:eastAsia="Arial" w:hAnsi="Arial" w:cs="Arial"/>
-          <w:sz w:val="22"/>
-          <w:szCs w:val="22"/>
-        </w:rPr>
-        <w:t>outputThread</w:t>
-      </w:r>
-      <w:proofErr w:type="spellEnd"/>
-      <w:r>
-        <w:rPr>
-          <w:rFonts w:ascii="Arial" w:eastAsia="Arial" w:hAnsi="Arial" w:cs="Arial"/>
-          <w:sz w:val="22"/>
-          <w:szCs w:val="22"/>
-        </w:rPr>
-        <w:t>(</w:t>
-      </w:r>
-      <w:proofErr w:type="gramEnd"/>
-      <w:r>
-        <w:rPr>
-          <w:rFonts w:ascii="Arial" w:eastAsia="Arial" w:hAnsi="Arial" w:cs="Arial"/>
-          <w:sz w:val="22"/>
-          <w:szCs w:val="22"/>
-        </w:rPr>
-        <w:t>) function and Assignment struct</w:t>
-      </w:r>
-    </w:p>
-    <w:p>
-      <w:pPr>
-        <w:spacing w:before="60" w:after="60"/>
-      </w:pPr>
-    </w:p>
-    <w:p>
-      <w:pPr>
-        <w:spacing w:before="60" w:after="60"/>
-      </w:pPr>
-      <w:r>
-        <w:rPr>
-          <w:rFonts w:ascii="Arial" w:eastAsia="Arial" w:hAnsi="Arial" w:cs="Arial"/>
-          <w:sz w:val="22"/>
-          <w:szCs w:val="22"/>
-        </w:rPr>
-        <w:t>The output thread sends the PUT /</w:t>
-      </w:r>
-      <w:proofErr w:type="spellStart"/>
-      <w:r>
-        <w:rPr>
-          <w:rFonts w:ascii="Arial" w:eastAsia="Arial" w:hAnsi="Arial" w:cs="Arial"/>
-          <w:sz w:val="22"/>
-          <w:szCs w:val="22"/>
-        </w:rPr>
-        <w:t>AddPersonToElevator</w:t>
-      </w:r>
-      <w:proofErr w:type="spellEnd"/>
-      <w:r>
-        <w:rPr>
-          <w:rFonts w:ascii="Arial" w:eastAsia="Arial" w:hAnsi="Arial" w:cs="Arial"/>
-          <w:sz w:val="22"/>
-          <w:szCs w:val="22"/>
-        </w:rPr>
-        <w:t xml:space="preserve"> request but never checks or logs the response. There is also no mechanism tracking whether passengers completed their journeys or how long it took. The </w:t>
-      </w:r>
-      <w:proofErr w:type="spellStart"/>
-      <w:r>
-        <w:rPr>
-          <w:rFonts w:ascii="Arial" w:eastAsia="Arial" w:hAnsi="Arial" w:cs="Arial"/>
-          <w:sz w:val="22"/>
-          <w:szCs w:val="22"/>
-        </w:rPr>
-        <w:t>arrivalTime</w:t>
-      </w:r>
-      <w:proofErr w:type="spellEnd"/>
-      <w:r>
-        <w:rPr>
-          <w:rFonts w:ascii="Arial" w:eastAsia="Arial" w:hAnsi="Arial" w:cs="Arial"/>
-          <w:sz w:val="22"/>
-          <w:szCs w:val="22"/>
-        </w:rPr>
-        <w:t xml:space="preserve"> field already captured in the Person struct is never used.</w:t>
+        <w:t>Location: outputThread() function and Assignment struct</w:t>
+      </w:r>
+    </w:p>
+    <w:p>
+      <w:pPr>
+        <w:spacing w:before="60" w:after="60"/>
+      </w:pPr>
+    </w:p>
+    <w:p>
+      <w:pPr>
+        <w:spacing w:before="60" w:after="60"/>
+      </w:pPr>
+      <w:r>
+        <w:rPr>
+          <w:rFonts w:ascii="Arial" w:eastAsia="Arial" w:hAnsi="Arial" w:cs="Arial"/>
+          <w:sz w:val="22"/>
+          <w:szCs w:val="22"/>
+        </w:rPr>
+        <w:t>The output thread sends the PUT /AddPersonToElevator request but never checks or logs the response. There is also no mechanism tracking whether passengers completed their journeys or how long it took. The arrivalTime field already captured in the Person struct is never used.</w:t>
       </w:r>
     </w:p>
     <w:p>
@@ -440,25 +272,7 @@
           <w:sz w:val="22"/>
           <w:szCs w:val="22"/>
         </w:rPr>
-        <w:t>Check and log the response from each PUT /</w:t>
-      </w:r>
-      <w:proofErr w:type="spellStart"/>
-      <w:r>
-        <w:rPr>
-          <w:rFonts w:ascii="Arial" w:eastAsia="Arial" w:hAnsi="Arial" w:cs="Arial"/>
-          <w:sz w:val="22"/>
-          <w:szCs w:val="22"/>
-        </w:rPr>
-        <w:t>AddPersonToElevator</w:t>
-      </w:r>
-      <w:proofErr w:type="spellEnd"/>
-      <w:r>
-        <w:rPr>
-          <w:rFonts w:ascii="Arial" w:eastAsia="Arial" w:hAnsi="Arial" w:cs="Arial"/>
-          <w:sz w:val="22"/>
-          <w:szCs w:val="22"/>
-        </w:rPr>
-        <w:t xml:space="preserve"> call</w:t>
+        <w:t>Check and log the response from each PUT /AddPersonToElevator call</w:t>
       </w:r>
     </w:p>
     <w:p>
@@ -494,36 +308,287 @@
           <w:sz w:val="22"/>
           <w:szCs w:val="22"/>
         </w:rPr>
-        <w:t xml:space="preserve">Use the </w:t>
-      </w:r>
-      <w:proofErr w:type="spellStart"/>
-      <w:r>
-        <w:rPr>
-          <w:rFonts w:ascii="Arial" w:eastAsia="Arial" w:hAnsi="Arial" w:cs="Arial"/>
-          <w:sz w:val="22"/>
-          <w:szCs w:val="22"/>
-        </w:rPr>
-        <w:t>arrivalTime</w:t>
-      </w:r>
-      <w:proofErr w:type="spellEnd"/>
-      <w:r>
-        <w:rPr>
-          <w:rFonts w:ascii="Arial" w:eastAsia="Arial" w:hAnsi="Arial" w:cs="Arial"/>
-          <w:sz w:val="22"/>
-          <w:szCs w:val="22"/>
-        </w:rPr>
-        <w:t xml:space="preserve"> field to calculate and record total journey time per passenger</w:t>
-      </w:r>
-    </w:p>
-    <w:p>
-      <w:pPr>
-        <w:spacing w:before="60" w:after="60"/>
-      </w:pPr>
-    </w:p>
-    <w:p>
-      <w:pPr>
-        <w:spacing w:before="60" w:after="60"/>
-      </w:pPr>
+        <w:t>Use the arrivalTime field to calculate and record total journey time per passenger</w:t>
+      </w:r>
+    </w:p>
+    <w:p>
+      <w:pPr>
+        <w:spacing w:before="60" w:after="60"/>
+      </w:pPr>
+    </w:p>
+    <w:p>
+      <w:pPr>
+        <w:spacing w:before="60" w:after="60"/>
+      </w:pPr>
+    </w:p>
+    <w:p>
+      <w:pPr>
+        <w:spacing w:before="60" w:after="60"/>
+      </w:pPr>
+    </w:p>
+    <w:p>
+      <w:pPr>
+        <w:pStyle w:val="Heading1"/>
+        <w:spacing w:before="300" w:after="120"/>
+      </w:pPr>
+      <w:r>
+        <w:rPr>
+          <w:rFonts w:ascii="Arial" w:eastAsia="Arial" w:hAnsi="Arial" w:cs="Arial"/>
+          <w:b/>
+          <w:bCs/>
+          <w:sz w:val="26"/>
+          <w:szCs w:val="26"/>
+        </w:rPr>
+        <w:t>Bug 3: /NextInput Response Parsing Broken</w:t>
+      </w:r>
+    </w:p>
+    <w:p>
+      <w:pPr>
+        <w:spacing w:before="60" w:after="60"/>
+      </w:pPr>
+      <w:r>
+        <w:rPr>
+          <w:rFonts w:ascii="Arial" w:eastAsia="Arial" w:hAnsi="Arial" w:cs="Arial"/>
+          <w:b/>
+          <w:bCs/>
+          <w:sz w:val="22"/>
+          <w:szCs w:val="22"/>
+        </w:rPr>
+        <w:t>Severity: High</w:t>
+      </w:r>
+    </w:p>
+    <w:p>
+      <w:pPr>
+        <w:spacing w:before="60" w:after="60"/>
+      </w:pPr>
+      <w:r>
+        <w:rPr>
+          <w:rFonts w:ascii="Arial" w:eastAsia="Arial" w:hAnsi="Arial" w:cs="Arial"/>
+          <w:sz w:val="22"/>
+          <w:szCs w:val="22"/>
+        </w:rPr>
+        <w:t>Location: inputThread() function</w:t>
+      </w:r>
+    </w:p>
+    <w:p>
+      <w:pPr>
+        <w:spacing w:before="60" w:after="60"/>
+      </w:pPr>
+    </w:p>
+    <w:p>
+      <w:pPr>
+        <w:spacing w:before="60" w:after="60"/>
+      </w:pPr>
+      <w:r>
+        <w:rPr>
+          <w:rFonts w:ascii="Arial" w:eastAsia="Arial" w:hAnsi="Arial" w:cs="Arial"/>
+          <w:sz w:val="22"/>
+          <w:szCs w:val="22"/>
+        </w:rPr>
+        <w:t xml:space="preserve">The inputThread uses parseField to extract personID, startFloor, and endFloor from the /NextInput response by looking for key=value pairs. However the API returns data in pipe-separated format: "P1 | 3 | 10". Since no key=value pairs exist in that response, all three fields </w:t>
+      </w:r>
+      <w:r>
+        <w:rPr>
+          <w:rFonts w:ascii="Arial" w:eastAsia="Arial" w:hAnsi="Arial" w:cs="Arial"/>
+          <w:sz w:val="22"/>
+          <w:szCs w:val="22"/>
+        </w:rPr>
+        <w:lastRenderedPageBreak/>
+        <w:t>come back empty and every person is silently skipped. This is confirmed by the grading report showing 0 people completed their journey despite 10 people being queued.</w:t>
+      </w:r>
+    </w:p>
+    <w:p>
+      <w:pPr>
+        <w:spacing w:before="60" w:after="60"/>
+      </w:pPr>
+    </w:p>
+    <w:p>
+      <w:pPr>
+        <w:spacing w:before="60" w:after="60"/>
+      </w:pPr>
+      <w:r>
+        <w:rPr>
+          <w:rFonts w:ascii="Arial" w:eastAsia="Arial" w:hAnsi="Arial" w:cs="Arial"/>
+          <w:sz w:val="22"/>
+          <w:szCs w:val="22"/>
+        </w:rPr>
+        <w:t>Fix needed:</w:t>
+      </w:r>
+    </w:p>
+    <w:p>
+      <w:pPr>
+        <w:pStyle w:val="ListParagraph"/>
+        <w:numPr>
+          <w:ilvl w:val="0"/>
+          <w:numId w:val="2"/>
+        </w:numPr>
+        <w:spacing w:before="60" w:after="60"/>
+      </w:pPr>
+      <w:r>
+        <w:rPr>
+          <w:rFonts w:ascii="Arial" w:eastAsia="Arial" w:hAnsi="Arial" w:cs="Arial"/>
+          <w:sz w:val="22"/>
+          <w:szCs w:val="22"/>
+        </w:rPr>
+        <w:t>Replace parseField calls with pipe-delimited parsing using stringstream and getline split on the | character</w:t>
+      </w:r>
+    </w:p>
+    <w:p>
+      <w:pPr>
+        <w:pStyle w:val="ListParagraph"/>
+        <w:numPr>
+          <w:ilvl w:val="0"/>
+          <w:numId w:val="2"/>
+        </w:numPr>
+        <w:spacing w:before="60" w:after="60"/>
+      </w:pPr>
+      <w:r>
+        <w:rPr>
+          <w:rFonts w:ascii="Arial" w:eastAsia="Arial" w:hAnsi="Arial" w:cs="Arial"/>
+          <w:sz w:val="22"/>
+          <w:szCs w:val="22"/>
+        </w:rPr>
+        <w:t>Trim whitespace from each parsed field before use</w:t>
+      </w:r>
+    </w:p>
+    <w:p>
+      <w:pPr>
+        <w:spacing w:before="60" w:after="60"/>
+      </w:pPr>
+    </w:p>
+    <w:p>
+      <w:pPr>
+        <w:pStyle w:val="Heading1"/>
+        <w:spacing w:before="300" w:after="120"/>
+      </w:pPr>
+      <w:r>
+        <w:rPr>
+          <w:rFonts w:ascii="Arial" w:eastAsia="Arial" w:hAnsi="Arial" w:cs="Arial"/>
+          <w:b/>
+          <w:bCs/>
+          <w:sz w:val="26"/>
+          <w:szCs w:val="26"/>
+        </w:rPr>
+        <w:t>Bug 4: /ElevatorStatus Response Parsing Broken</w:t>
+      </w:r>
+    </w:p>
+    <w:p>
+      <w:pPr>
+        <w:spacing w:before="60" w:after="60"/>
+      </w:pPr>
+      <w:r>
+        <w:rPr>
+          <w:rFonts w:ascii="Arial" w:eastAsia="Arial" w:hAnsi="Arial" w:cs="Arial"/>
+          <w:b/>
+          <w:bCs/>
+          <w:sz w:val="22"/>
+          <w:szCs w:val="22"/>
+        </w:rPr>
+        <w:t>Severity: High</w:t>
+      </w:r>
+    </w:p>
+    <w:p>
+      <w:pPr>
+        <w:spacing w:before="60" w:after="60"/>
+      </w:pPr>
+      <w:r>
+        <w:rPr>
+          <w:rFonts w:ascii="Arial" w:eastAsia="Arial" w:hAnsi="Arial" w:cs="Arial"/>
+          <w:sz w:val="22"/>
+          <w:szCs w:val="22"/>
+        </w:rPr>
+        <w:t>Location: schedulerThread() function</w:t>
+      </w:r>
+    </w:p>
+    <w:p>
+      <w:pPr>
+        <w:spacing w:before="60" w:after="60"/>
+      </w:pPr>
+    </w:p>
+    <w:p>
+      <w:pPr>
+        <w:spacing w:before="60" w:after="60"/>
+      </w:pPr>
+      <w:r>
+        <w:rPr>
+          <w:rFonts w:ascii="Arial" w:eastAsia="Arial" w:hAnsi="Arial" w:cs="Arial"/>
+          <w:sz w:val="22"/>
+          <w:szCs w:val="22"/>
+        </w:rPr>
+        <w:t>The schedulerThread uses parseField to extract lowest, highest, and currentFloor from the /ElevatorStatus response by looking for key=value pairs. However the API returns data in pipe-separated format: "HotelBayA | 3 | U | 0 | 8". Since no key=value pairs exist, all three fields came back as defaults and no valid elevator was ever selected. This caused the scheduler to re-queue every passenger indefinitely and never issue any assignments.</w:t>
+      </w:r>
+    </w:p>
+    <w:p>
+      <w:pPr>
+        <w:spacing w:before="60" w:after="60"/>
+      </w:pPr>
+    </w:p>
+    <w:p>
+      <w:pPr>
+        <w:spacing w:before="60" w:after="60"/>
+      </w:pPr>
+      <w:r>
+        <w:rPr>
+          <w:rFonts w:ascii="Arial" w:eastAsia="Arial" w:hAnsi="Arial" w:cs="Arial"/>
+          <w:sz w:val="22"/>
+          <w:szCs w:val="22"/>
+        </w:rPr>
+        <w:t>Fix needed:</w:t>
+      </w:r>
+    </w:p>
+    <w:p>
+      <w:pPr>
+        <w:pStyle w:val="ListParagraph"/>
+        <w:numPr>
+          <w:ilvl w:val="0"/>
+          <w:numId w:val="2"/>
+        </w:numPr>
+        <w:spacing w:before="60" w:after="60"/>
+      </w:pPr>
+      <w:r>
+        <w:rPr>
+          <w:rFonts w:ascii="Arial" w:eastAsia="Arial" w:hAnsi="Arial" w:cs="Arial"/>
+          <w:sz w:val="22"/>
+          <w:szCs w:val="22"/>
+        </w:rPr>
+        <w:t>Replace parseField calls with pipe-delimited parsing using stringstream and getline split on the | character</w:t>
+      </w:r>
+    </w:p>
+    <w:p>
+      <w:pPr>
+        <w:pStyle w:val="ListParagraph"/>
+        <w:numPr>
+          <w:ilvl w:val="0"/>
+          <w:numId w:val="2"/>
+        </w:numPr>
+        <w:spacing w:before="60" w:after="60"/>
+      </w:pPr>
+      <w:r>
+        <w:rPr>
+          <w:rFonts w:ascii="Arial" w:eastAsia="Arial" w:hAnsi="Arial" w:cs="Arial"/>
+          <w:sz w:val="22"/>
+          <w:szCs w:val="22"/>
+        </w:rPr>
+        <w:t>Remove the lowest and highest floor range checks since those values are not available in the elevator status response</w:t>
+      </w:r>
+    </w:p>
+    <w:p>
+      <w:pPr>
+        <w:pStyle w:val="ListParagraph"/>
+        <w:numPr>
+          <w:ilvl w:val="0"/>
+          <w:numId w:val="2"/>
+        </w:numPr>
+        <w:spacing w:before="60" w:after="60"/>
+      </w:pPr>
+      <w:r>
+        <w:rPr>
+          <w:rFonts w:ascii="Arial" w:eastAsia="Arial" w:hAnsi="Arial" w:cs="Arial"/>
+          <w:sz w:val="22"/>
+          <w:szCs w:val="22"/>
+        </w:rPr>
+        <w:t>Use remainingCapacity from the parsed response to skip elevators that are full</w:t>
+      </w:r>
     </w:p>
     <w:p>
       <w:pPr>

</xml_diff>